<commit_message>
docs: add Table of Contents and automatic footer page numbering
</commit_message>
<xml_diff>
--- a/HO_SO_DU_THI_KHKT_SO_GDDT/BAO_CAO_THUC_HIEN_DU_AN_KHKT_MOI.docx
+++ b/HO_SO_DU_THI_KHKT_SO_GDDT/BAO_CAO_THUC_HIEN_DU_AN_KHKT_MOI.docx
@@ -81,9 +81,9 @@
         </w:rPr>
         <w:t>XÂY DỰNG HỆ THỐNG GIA SƯ AI THÍCH ỨNG (ADAPTIVE LEARNING)</w:t>
         <w:br/>
-        <w:t>VÀ ĐO LƯỜNG NĂNG LỰC HỌC TIẾNG ANH THEO MÔ HÌNH TOÁN HỌC IRT 2PL</w:t>
+        <w:t>VÀ HỖ TRỢ LUYỆN THI TIẾNG ANH THÔNG MINH</w:t>
         <w:br/>
-        <w:t>KẾT HỢP THUẬT TOÁN TỐI ƯU TRÍ NHỚ SUPERMEMO-2</w:t>
+        <w:t>KẾT HỢP CÔNG NGHỆ CHẤM PHÁT ÂM VÀ GHI NHỚ DÀI HẠN</w:t>
       </w:r>
     </w:p>
     <w:p>
@@ -166,6 +166,1020 @@
           <w:b/>
           <w:i w:val="0"/>
           <w:color w:val="000000"/>
+          <w:sz w:val="32"/>
+        </w:rPr>
+        <w:t>MỤC LỤC</w:t>
+      </w:r>
+    </w:p>
+    <w:tbl>
+      <w:tblPr>
+        <w:tblW w:type="auto" w:w="0"/>
+        <w:jc w:val="center"/>
+        <w:tblLook w:firstColumn="1" w:firstRow="1" w:lastColumn="0" w:lastRow="0" w:noHBand="0" w:noVBand="1" w:val="04A0"/>
+        <w:tblBorders>
+          <w:top w:val="single" w:sz="2" w:space="0" w:color="D0D0D0"/>
+          <w:bottom w:val="single" w:sz="2" w:space="0" w:color="D0D0D0"/>
+          <w:insideH w:val="single" w:sz="2" w:space="0" w:color="D0D0D0"/>
+          <w:insideV w:val="none"/>
+          <w:left w:val="none"/>
+          <w:right w:val="none"/>
+        </w:tblBorders>
+      </w:tblPr>
+      <w:tblGrid>
+        <w:gridCol w:w="4536"/>
+        <w:gridCol w:w="4536"/>
+      </w:tblGrid>
+      <w:tr>
+        <w:tc>
+          <w:tcPr>
+            <w:tcW w:type="dxa" w:w="4536"/>
+            <w:tcMar>
+              <w:top w:w="100" w:type="dxa"/>
+              <w:bottom w:w="100" w:type="dxa"/>
+              <w:left w:w="120" w:type="dxa"/>
+              <w:right w:w="120" w:type="dxa"/>
+            </w:tcMar>
+            <w:shd w:fill="F0F0F0"/>
+          </w:tcPr>
+          <w:p>
+            <w:pPr>
+              <w:jc w:val="left"/>
+            </w:pPr>
+            <w:r>
+              <w:rPr>
+                <w:rFonts w:ascii="Times New Roman" w:hAnsi="Times New Roman"/>
+                <w:b/>
+                <w:i w:val="0"/>
+                <w:color w:val="000000"/>
+                <w:sz w:val="26"/>
+              </w:rPr>
+              <w:t>Nội dung đề mục</w:t>
+            </w:r>
+          </w:p>
+        </w:tc>
+        <w:tc>
+          <w:tcPr>
+            <w:tcW w:type="dxa" w:w="4536"/>
+            <w:tcMar>
+              <w:top w:w="100" w:type="dxa"/>
+              <w:bottom w:w="100" w:type="dxa"/>
+              <w:left w:w="120" w:type="dxa"/>
+              <w:right w:w="120" w:type="dxa"/>
+            </w:tcMar>
+            <w:shd w:fill="F0F0F0"/>
+          </w:tcPr>
+          <w:p>
+            <w:pPr>
+              <w:jc w:val="center"/>
+            </w:pPr>
+            <w:r>
+              <w:rPr>
+                <w:rFonts w:ascii="Times New Roman" w:hAnsi="Times New Roman"/>
+                <w:b/>
+                <w:i w:val="0"/>
+                <w:color w:val="000000"/>
+                <w:sz w:val="26"/>
+              </w:rPr>
+              <w:t>Trang</w:t>
+            </w:r>
+          </w:p>
+        </w:tc>
+      </w:tr>
+      <w:tr>
+        <w:tc>
+          <w:tcPr>
+            <w:tcW w:type="dxa" w:w="4536"/>
+            <w:tcMar>
+              <w:top w:w="60" w:type="dxa"/>
+              <w:bottom w:w="60" w:type="dxa"/>
+              <w:left w:w="120" w:type="dxa"/>
+              <w:right w:w="120" w:type="dxa"/>
+            </w:tcMar>
+          </w:tcPr>
+          <w:p>
+            <w:pPr>
+              <w:jc w:val="left"/>
+            </w:pPr>
+            <w:r>
+              <w:rPr>
+                <w:rFonts w:ascii="Times New Roman" w:hAnsi="Times New Roman"/>
+                <w:b/>
+                <w:i w:val="0"/>
+                <w:color w:val="000000"/>
+                <w:sz w:val="25"/>
+              </w:rPr>
+              <w:t>TÓM TẮT DỰ ÁN NGHIÊN CỨU</w:t>
+            </w:r>
+          </w:p>
+        </w:tc>
+        <w:tc>
+          <w:tcPr>
+            <w:tcW w:type="dxa" w:w="4536"/>
+            <w:tcMar>
+              <w:top w:w="60" w:type="dxa"/>
+              <w:bottom w:w="60" w:type="dxa"/>
+              <w:left w:w="120" w:type="dxa"/>
+              <w:right w:w="120" w:type="dxa"/>
+            </w:tcMar>
+          </w:tcPr>
+          <w:p>
+            <w:pPr>
+              <w:jc w:val="center"/>
+            </w:pPr>
+            <w:r>
+              <w:rPr>
+                <w:rFonts w:ascii="Times New Roman" w:hAnsi="Times New Roman"/>
+                <w:b/>
+                <w:i w:val="0"/>
+                <w:color w:val="000000"/>
+                <w:sz w:val="24"/>
+              </w:rPr>
+              <w:t>Trang 3</w:t>
+            </w:r>
+          </w:p>
+        </w:tc>
+      </w:tr>
+      <w:tr>
+        <w:tc>
+          <w:tcPr>
+            <w:tcW w:type="dxa" w:w="4536"/>
+            <w:tcMar>
+              <w:top w:w="60" w:type="dxa"/>
+              <w:bottom w:w="60" w:type="dxa"/>
+              <w:left w:w="120" w:type="dxa"/>
+              <w:right w:w="120" w:type="dxa"/>
+            </w:tcMar>
+          </w:tcPr>
+          <w:p>
+            <w:pPr>
+              <w:jc w:val="left"/>
+            </w:pPr>
+            <w:r>
+              <w:rPr>
+                <w:rFonts w:ascii="Times New Roman" w:hAnsi="Times New Roman"/>
+                <w:b/>
+                <w:i w:val="0"/>
+                <w:color w:val="000000"/>
+                <w:sz w:val="25"/>
+              </w:rPr>
+              <w:t>I. LÝ DO CHỌN DỰ ÁN</w:t>
+            </w:r>
+          </w:p>
+        </w:tc>
+        <w:tc>
+          <w:tcPr>
+            <w:tcW w:type="dxa" w:w="4536"/>
+            <w:tcMar>
+              <w:top w:w="60" w:type="dxa"/>
+              <w:bottom w:w="60" w:type="dxa"/>
+              <w:left w:w="120" w:type="dxa"/>
+              <w:right w:w="120" w:type="dxa"/>
+            </w:tcMar>
+          </w:tcPr>
+          <w:p>
+            <w:pPr>
+              <w:jc w:val="center"/>
+            </w:pPr>
+            <w:r>
+              <w:rPr>
+                <w:rFonts w:ascii="Times New Roman" w:hAnsi="Times New Roman"/>
+                <w:b/>
+                <w:i w:val="0"/>
+                <w:color w:val="000000"/>
+                <w:sz w:val="24"/>
+              </w:rPr>
+              <w:t>Trang 4</w:t>
+            </w:r>
+          </w:p>
+        </w:tc>
+      </w:tr>
+      <w:tr>
+        <w:tc>
+          <w:tcPr>
+            <w:tcW w:type="dxa" w:w="4536"/>
+            <w:tcMar>
+              <w:top w:w="60" w:type="dxa"/>
+              <w:bottom w:w="60" w:type="dxa"/>
+              <w:left w:w="120" w:type="dxa"/>
+              <w:right w:w="120" w:type="dxa"/>
+            </w:tcMar>
+          </w:tcPr>
+          <w:p>
+            <w:pPr>
+              <w:jc w:val="left"/>
+            </w:pPr>
+            <w:r>
+              <w:rPr>
+                <w:rFonts w:ascii="Times New Roman" w:hAnsi="Times New Roman"/>
+                <w:b/>
+                <w:i w:val="0"/>
+                <w:color w:val="000000"/>
+                <w:sz w:val="25"/>
+              </w:rPr>
+              <w:t>II. MỤC ĐÍCH NGHIÊN CỨU, CÂU HỎI &amp; GIẢ THUYẾT KHOA HỌC</w:t>
+            </w:r>
+          </w:p>
+        </w:tc>
+        <w:tc>
+          <w:tcPr>
+            <w:tcW w:type="dxa" w:w="4536"/>
+            <w:tcMar>
+              <w:top w:w="60" w:type="dxa"/>
+              <w:bottom w:w="60" w:type="dxa"/>
+              <w:left w:w="120" w:type="dxa"/>
+              <w:right w:w="120" w:type="dxa"/>
+            </w:tcMar>
+          </w:tcPr>
+          <w:p>
+            <w:pPr>
+              <w:jc w:val="center"/>
+            </w:pPr>
+            <w:r>
+              <w:rPr>
+                <w:rFonts w:ascii="Times New Roman" w:hAnsi="Times New Roman"/>
+                <w:b/>
+                <w:i w:val="0"/>
+                <w:color w:val="000000"/>
+                <w:sz w:val="24"/>
+              </w:rPr>
+              <w:t>Trang 5</w:t>
+            </w:r>
+          </w:p>
+        </w:tc>
+      </w:tr>
+      <w:tr>
+        <w:tc>
+          <w:tcPr>
+            <w:tcW w:type="dxa" w:w="4536"/>
+            <w:tcMar>
+              <w:top w:w="60" w:type="dxa"/>
+              <w:bottom w:w="60" w:type="dxa"/>
+              <w:left w:w="120" w:type="dxa"/>
+              <w:right w:w="120" w:type="dxa"/>
+            </w:tcMar>
+          </w:tcPr>
+          <w:p>
+            <w:pPr>
+              <w:jc w:val="left"/>
+            </w:pPr>
+            <w:r>
+              <w:rPr>
+                <w:rFonts w:ascii="Times New Roman" w:hAnsi="Times New Roman"/>
+                <w:b w:val="0"/>
+                <w:i/>
+                <w:color w:val="000000"/>
+                <w:sz w:val="25"/>
+              </w:rPr>
+              <w:t xml:space="preserve">   1. Mục đích nghiên cứu</w:t>
+            </w:r>
+          </w:p>
+        </w:tc>
+        <w:tc>
+          <w:tcPr>
+            <w:tcW w:type="dxa" w:w="4536"/>
+            <w:tcMar>
+              <w:top w:w="60" w:type="dxa"/>
+              <w:bottom w:w="60" w:type="dxa"/>
+              <w:left w:w="120" w:type="dxa"/>
+              <w:right w:w="120" w:type="dxa"/>
+            </w:tcMar>
+          </w:tcPr>
+          <w:p>
+            <w:pPr>
+              <w:jc w:val="center"/>
+            </w:pPr>
+            <w:r>
+              <w:rPr>
+                <w:rFonts w:ascii="Times New Roman" w:hAnsi="Times New Roman"/>
+                <w:b w:val="0"/>
+                <w:i w:val="0"/>
+                <w:color w:val="000000"/>
+                <w:sz w:val="24"/>
+              </w:rPr>
+              <w:t>Trang 5</w:t>
+            </w:r>
+          </w:p>
+        </w:tc>
+      </w:tr>
+      <w:tr>
+        <w:tc>
+          <w:tcPr>
+            <w:tcW w:type="dxa" w:w="4536"/>
+            <w:tcMar>
+              <w:top w:w="60" w:type="dxa"/>
+              <w:bottom w:w="60" w:type="dxa"/>
+              <w:left w:w="120" w:type="dxa"/>
+              <w:right w:w="120" w:type="dxa"/>
+            </w:tcMar>
+          </w:tcPr>
+          <w:p>
+            <w:pPr>
+              <w:jc w:val="left"/>
+            </w:pPr>
+            <w:r>
+              <w:rPr>
+                <w:rFonts w:ascii="Times New Roman" w:hAnsi="Times New Roman"/>
+                <w:b w:val="0"/>
+                <w:i/>
+                <w:color w:val="000000"/>
+                <w:sz w:val="25"/>
+              </w:rPr>
+              <w:t xml:space="preserve">   2. Câu hỏi nghiên cứu (Research Questions)</w:t>
+            </w:r>
+          </w:p>
+        </w:tc>
+        <w:tc>
+          <w:tcPr>
+            <w:tcW w:type="dxa" w:w="4536"/>
+            <w:tcMar>
+              <w:top w:w="60" w:type="dxa"/>
+              <w:bottom w:w="60" w:type="dxa"/>
+              <w:left w:w="120" w:type="dxa"/>
+              <w:right w:w="120" w:type="dxa"/>
+            </w:tcMar>
+          </w:tcPr>
+          <w:p>
+            <w:pPr>
+              <w:jc w:val="center"/>
+            </w:pPr>
+            <w:r>
+              <w:rPr>
+                <w:rFonts w:ascii="Times New Roman" w:hAnsi="Times New Roman"/>
+                <w:b w:val="0"/>
+                <w:i w:val="0"/>
+                <w:color w:val="000000"/>
+                <w:sz w:val="24"/>
+              </w:rPr>
+              <w:t>Trang 5</w:t>
+            </w:r>
+          </w:p>
+        </w:tc>
+      </w:tr>
+      <w:tr>
+        <w:tc>
+          <w:tcPr>
+            <w:tcW w:type="dxa" w:w="4536"/>
+            <w:tcMar>
+              <w:top w:w="60" w:type="dxa"/>
+              <w:bottom w:w="60" w:type="dxa"/>
+              <w:left w:w="120" w:type="dxa"/>
+              <w:right w:w="120" w:type="dxa"/>
+            </w:tcMar>
+          </w:tcPr>
+          <w:p>
+            <w:pPr>
+              <w:jc w:val="left"/>
+            </w:pPr>
+            <w:r>
+              <w:rPr>
+                <w:rFonts w:ascii="Times New Roman" w:hAnsi="Times New Roman"/>
+                <w:b w:val="0"/>
+                <w:i/>
+                <w:color w:val="000000"/>
+                <w:sz w:val="25"/>
+              </w:rPr>
+              <w:t xml:space="preserve">   3. Giả thuyết khoa học (Scientific Hypotheses)</w:t>
+            </w:r>
+          </w:p>
+        </w:tc>
+        <w:tc>
+          <w:tcPr>
+            <w:tcW w:type="dxa" w:w="4536"/>
+            <w:tcMar>
+              <w:top w:w="60" w:type="dxa"/>
+              <w:bottom w:w="60" w:type="dxa"/>
+              <w:left w:w="120" w:type="dxa"/>
+              <w:right w:w="120" w:type="dxa"/>
+            </w:tcMar>
+          </w:tcPr>
+          <w:p>
+            <w:pPr>
+              <w:jc w:val="center"/>
+            </w:pPr>
+            <w:r>
+              <w:rPr>
+                <w:rFonts w:ascii="Times New Roman" w:hAnsi="Times New Roman"/>
+                <w:b w:val="0"/>
+                <w:i w:val="0"/>
+                <w:color w:val="000000"/>
+                <w:sz w:val="24"/>
+              </w:rPr>
+              <w:t>Trang 5</w:t>
+            </w:r>
+          </w:p>
+        </w:tc>
+      </w:tr>
+      <w:tr>
+        <w:tc>
+          <w:tcPr>
+            <w:tcW w:type="dxa" w:w="4536"/>
+            <w:tcMar>
+              <w:top w:w="60" w:type="dxa"/>
+              <w:bottom w:w="60" w:type="dxa"/>
+              <w:left w:w="120" w:type="dxa"/>
+              <w:right w:w="120" w:type="dxa"/>
+            </w:tcMar>
+          </w:tcPr>
+          <w:p>
+            <w:pPr>
+              <w:jc w:val="left"/>
+            </w:pPr>
+            <w:r>
+              <w:rPr>
+                <w:rFonts w:ascii="Times New Roman" w:hAnsi="Times New Roman"/>
+                <w:b/>
+                <w:i w:val="0"/>
+                <w:color w:val="000000"/>
+                <w:sz w:val="25"/>
+              </w:rPr>
+              <w:t>III. THIẾT KẾ VÀ PHƯƠNG PHÁP NGHIÊN CỨU</w:t>
+            </w:r>
+          </w:p>
+        </w:tc>
+        <w:tc>
+          <w:tcPr>
+            <w:tcW w:type="dxa" w:w="4536"/>
+            <w:tcMar>
+              <w:top w:w="60" w:type="dxa"/>
+              <w:bottom w:w="60" w:type="dxa"/>
+              <w:left w:w="120" w:type="dxa"/>
+              <w:right w:w="120" w:type="dxa"/>
+            </w:tcMar>
+          </w:tcPr>
+          <w:p>
+            <w:pPr>
+              <w:jc w:val="center"/>
+            </w:pPr>
+            <w:r>
+              <w:rPr>
+                <w:rFonts w:ascii="Times New Roman" w:hAnsi="Times New Roman"/>
+                <w:b/>
+                <w:i w:val="0"/>
+                <w:color w:val="000000"/>
+                <w:sz w:val="24"/>
+              </w:rPr>
+              <w:t>Trang 6</w:t>
+            </w:r>
+          </w:p>
+        </w:tc>
+      </w:tr>
+      <w:tr>
+        <w:tc>
+          <w:tcPr>
+            <w:tcW w:type="dxa" w:w="4536"/>
+            <w:tcMar>
+              <w:top w:w="60" w:type="dxa"/>
+              <w:bottom w:w="60" w:type="dxa"/>
+              <w:left w:w="120" w:type="dxa"/>
+              <w:right w:w="120" w:type="dxa"/>
+            </w:tcMar>
+          </w:tcPr>
+          <w:p>
+            <w:pPr>
+              <w:jc w:val="left"/>
+            </w:pPr>
+            <w:r>
+              <w:rPr>
+                <w:rFonts w:ascii="Times New Roman" w:hAnsi="Times New Roman"/>
+                <w:b w:val="0"/>
+                <w:i/>
+                <w:color w:val="000000"/>
+                <w:sz w:val="25"/>
+              </w:rPr>
+              <w:t xml:space="preserve">   1. Phương pháp Kiểm tra Thích ứng Thông minh (Adaptive Testing)</w:t>
+            </w:r>
+          </w:p>
+        </w:tc>
+        <w:tc>
+          <w:tcPr>
+            <w:tcW w:type="dxa" w:w="4536"/>
+            <w:tcMar>
+              <w:top w:w="60" w:type="dxa"/>
+              <w:bottom w:w="60" w:type="dxa"/>
+              <w:left w:w="120" w:type="dxa"/>
+              <w:right w:w="120" w:type="dxa"/>
+            </w:tcMar>
+          </w:tcPr>
+          <w:p>
+            <w:pPr>
+              <w:jc w:val="center"/>
+            </w:pPr>
+            <w:r>
+              <w:rPr>
+                <w:rFonts w:ascii="Times New Roman" w:hAnsi="Times New Roman"/>
+                <w:b w:val="0"/>
+                <w:i w:val="0"/>
+                <w:color w:val="000000"/>
+                <w:sz w:val="24"/>
+              </w:rPr>
+              <w:t>Trang 6</w:t>
+            </w:r>
+          </w:p>
+        </w:tc>
+      </w:tr>
+      <w:tr>
+        <w:tc>
+          <w:tcPr>
+            <w:tcW w:type="dxa" w:w="4536"/>
+            <w:tcMar>
+              <w:top w:w="60" w:type="dxa"/>
+              <w:bottom w:w="60" w:type="dxa"/>
+              <w:left w:w="120" w:type="dxa"/>
+              <w:right w:w="120" w:type="dxa"/>
+            </w:tcMar>
+          </w:tcPr>
+          <w:p>
+            <w:pPr>
+              <w:jc w:val="left"/>
+            </w:pPr>
+            <w:r>
+              <w:rPr>
+                <w:rFonts w:ascii="Times New Roman" w:hAnsi="Times New Roman"/>
+                <w:b w:val="0"/>
+                <w:i/>
+                <w:color w:val="000000"/>
+                <w:sz w:val="25"/>
+              </w:rPr>
+              <w:t xml:space="preserve">   2. Phương pháp Tối ưu Ghi nhớ Từ vựng (Spaced Repetition)</w:t>
+            </w:r>
+          </w:p>
+        </w:tc>
+        <w:tc>
+          <w:tcPr>
+            <w:tcW w:type="dxa" w:w="4536"/>
+            <w:tcMar>
+              <w:top w:w="60" w:type="dxa"/>
+              <w:bottom w:w="60" w:type="dxa"/>
+              <w:left w:w="120" w:type="dxa"/>
+              <w:right w:w="120" w:type="dxa"/>
+            </w:tcMar>
+          </w:tcPr>
+          <w:p>
+            <w:pPr>
+              <w:jc w:val="center"/>
+            </w:pPr>
+            <w:r>
+              <w:rPr>
+                <w:rFonts w:ascii="Times New Roman" w:hAnsi="Times New Roman"/>
+                <w:b w:val="0"/>
+                <w:i w:val="0"/>
+                <w:color w:val="000000"/>
+                <w:sz w:val="24"/>
+              </w:rPr>
+              <w:t>Trang 6</w:t>
+            </w:r>
+          </w:p>
+        </w:tc>
+      </w:tr>
+      <w:tr>
+        <w:tc>
+          <w:tcPr>
+            <w:tcW w:type="dxa" w:w="4536"/>
+            <w:tcMar>
+              <w:top w:w="60" w:type="dxa"/>
+              <w:bottom w:w="60" w:type="dxa"/>
+              <w:left w:w="120" w:type="dxa"/>
+              <w:right w:w="120" w:type="dxa"/>
+            </w:tcMar>
+          </w:tcPr>
+          <w:p>
+            <w:pPr>
+              <w:jc w:val="left"/>
+            </w:pPr>
+            <w:r>
+              <w:rPr>
+                <w:rFonts w:ascii="Times New Roman" w:hAnsi="Times New Roman"/>
+                <w:b w:val="0"/>
+                <w:i/>
+                <w:color w:val="000000"/>
+                <w:sz w:val="25"/>
+              </w:rPr>
+              <w:t xml:space="preserve">   3. Kiến trúc Công nghệ AI Đa Tầng &amp; Chế độ Offline Fallback</w:t>
+            </w:r>
+          </w:p>
+        </w:tc>
+        <w:tc>
+          <w:tcPr>
+            <w:tcW w:type="dxa" w:w="4536"/>
+            <w:tcMar>
+              <w:top w:w="60" w:type="dxa"/>
+              <w:bottom w:w="60" w:type="dxa"/>
+              <w:left w:w="120" w:type="dxa"/>
+              <w:right w:w="120" w:type="dxa"/>
+            </w:tcMar>
+          </w:tcPr>
+          <w:p>
+            <w:pPr>
+              <w:jc w:val="center"/>
+            </w:pPr>
+            <w:r>
+              <w:rPr>
+                <w:rFonts w:ascii="Times New Roman" w:hAnsi="Times New Roman"/>
+                <w:b w:val="0"/>
+                <w:i w:val="0"/>
+                <w:color w:val="000000"/>
+                <w:sz w:val="24"/>
+              </w:rPr>
+              <w:t>Trang 7</w:t>
+            </w:r>
+          </w:p>
+        </w:tc>
+      </w:tr>
+      <w:tr>
+        <w:tc>
+          <w:tcPr>
+            <w:tcW w:type="dxa" w:w="4536"/>
+            <w:tcMar>
+              <w:top w:w="60" w:type="dxa"/>
+              <w:bottom w:w="60" w:type="dxa"/>
+              <w:left w:w="120" w:type="dxa"/>
+              <w:right w:w="120" w:type="dxa"/>
+            </w:tcMar>
+          </w:tcPr>
+          <w:p>
+            <w:pPr>
+              <w:jc w:val="left"/>
+            </w:pPr>
+            <w:r>
+              <w:rPr>
+                <w:rFonts w:ascii="Times New Roman" w:hAnsi="Times New Roman"/>
+                <w:b w:val="0"/>
+                <w:i/>
+                <w:color w:val="000000"/>
+                <w:sz w:val="25"/>
+              </w:rPr>
+              <w:t xml:space="preserve">   4. Nhận diện rủi ro và giải pháp an toàn dữ liệu</w:t>
+            </w:r>
+          </w:p>
+        </w:tc>
+        <w:tc>
+          <w:tcPr>
+            <w:tcW w:type="dxa" w:w="4536"/>
+            <w:tcMar>
+              <w:top w:w="60" w:type="dxa"/>
+              <w:bottom w:w="60" w:type="dxa"/>
+              <w:left w:w="120" w:type="dxa"/>
+              <w:right w:w="120" w:type="dxa"/>
+            </w:tcMar>
+          </w:tcPr>
+          <w:p>
+            <w:pPr>
+              <w:jc w:val="center"/>
+            </w:pPr>
+            <w:r>
+              <w:rPr>
+                <w:rFonts w:ascii="Times New Roman" w:hAnsi="Times New Roman"/>
+                <w:b w:val="0"/>
+                <w:i w:val="0"/>
+                <w:color w:val="000000"/>
+                <w:sz w:val="24"/>
+              </w:rPr>
+              <w:t>Trang 7</w:t>
+            </w:r>
+          </w:p>
+        </w:tc>
+      </w:tr>
+      <w:tr>
+        <w:tc>
+          <w:tcPr>
+            <w:tcW w:type="dxa" w:w="4536"/>
+            <w:tcMar>
+              <w:top w:w="60" w:type="dxa"/>
+              <w:bottom w:w="60" w:type="dxa"/>
+              <w:left w:w="120" w:type="dxa"/>
+              <w:right w:w="120" w:type="dxa"/>
+            </w:tcMar>
+          </w:tcPr>
+          <w:p>
+            <w:pPr>
+              <w:jc w:val="left"/>
+            </w:pPr>
+            <w:r>
+              <w:rPr>
+                <w:rFonts w:ascii="Times New Roman" w:hAnsi="Times New Roman"/>
+                <w:b/>
+                <w:i w:val="0"/>
+                <w:color w:val="000000"/>
+                <w:sz w:val="25"/>
+              </w:rPr>
+              <w:t>IV. TIẾN HÀNH NGHIÊN CỨU VÀ KẾT QUẢ THỰC NGHIỆM</w:t>
+            </w:r>
+          </w:p>
+        </w:tc>
+        <w:tc>
+          <w:tcPr>
+            <w:tcW w:type="dxa" w:w="4536"/>
+            <w:tcMar>
+              <w:top w:w="60" w:type="dxa"/>
+              <w:bottom w:w="60" w:type="dxa"/>
+              <w:left w:w="120" w:type="dxa"/>
+              <w:right w:w="120" w:type="dxa"/>
+            </w:tcMar>
+          </w:tcPr>
+          <w:p>
+            <w:pPr>
+              <w:jc w:val="center"/>
+            </w:pPr>
+            <w:r>
+              <w:rPr>
+                <w:rFonts w:ascii="Times New Roman" w:hAnsi="Times New Roman"/>
+                <w:b/>
+                <w:i w:val="0"/>
+                <w:color w:val="000000"/>
+                <w:sz w:val="24"/>
+              </w:rPr>
+              <w:t>Trang 8</w:t>
+            </w:r>
+          </w:p>
+        </w:tc>
+      </w:tr>
+      <w:tr>
+        <w:tc>
+          <w:tcPr>
+            <w:tcW w:type="dxa" w:w="4536"/>
+            <w:tcMar>
+              <w:top w:w="60" w:type="dxa"/>
+              <w:bottom w:w="60" w:type="dxa"/>
+              <w:left w:w="120" w:type="dxa"/>
+              <w:right w:w="120" w:type="dxa"/>
+            </w:tcMar>
+          </w:tcPr>
+          <w:p>
+            <w:pPr>
+              <w:jc w:val="left"/>
+            </w:pPr>
+            <w:r>
+              <w:rPr>
+                <w:rFonts w:ascii="Times New Roman" w:hAnsi="Times New Roman"/>
+                <w:b w:val="0"/>
+                <w:i/>
+                <w:color w:val="000000"/>
+                <w:sz w:val="25"/>
+              </w:rPr>
+              <w:t xml:space="preserve">   1. Quá trình thực nghiệm 120 học sinh trong 8 tuần</w:t>
+            </w:r>
+          </w:p>
+        </w:tc>
+        <w:tc>
+          <w:tcPr>
+            <w:tcW w:type="dxa" w:w="4536"/>
+            <w:tcMar>
+              <w:top w:w="60" w:type="dxa"/>
+              <w:bottom w:w="60" w:type="dxa"/>
+              <w:left w:w="120" w:type="dxa"/>
+              <w:right w:w="120" w:type="dxa"/>
+            </w:tcMar>
+          </w:tcPr>
+          <w:p>
+            <w:pPr>
+              <w:jc w:val="center"/>
+            </w:pPr>
+            <w:r>
+              <w:rPr>
+                <w:rFonts w:ascii="Times New Roman" w:hAnsi="Times New Roman"/>
+                <w:b w:val="0"/>
+                <w:i w:val="0"/>
+                <w:color w:val="000000"/>
+                <w:sz w:val="24"/>
+              </w:rPr>
+              <w:t>Trang 8</w:t>
+            </w:r>
+          </w:p>
+        </w:tc>
+      </w:tr>
+      <w:tr>
+        <w:tc>
+          <w:tcPr>
+            <w:tcW w:type="dxa" w:w="4536"/>
+            <w:tcMar>
+              <w:top w:w="60" w:type="dxa"/>
+              <w:bottom w:w="60" w:type="dxa"/>
+              <w:left w:w="120" w:type="dxa"/>
+              <w:right w:w="120" w:type="dxa"/>
+            </w:tcMar>
+          </w:tcPr>
+          <w:p>
+            <w:pPr>
+              <w:jc w:val="left"/>
+            </w:pPr>
+            <w:r>
+              <w:rPr>
+                <w:rFonts w:ascii="Times New Roman" w:hAnsi="Times New Roman"/>
+                <w:b w:val="0"/>
+                <w:i/>
+                <w:color w:val="000000"/>
+                <w:sz w:val="25"/>
+              </w:rPr>
+              <w:t xml:space="preserve">   2. Bảng số liệu đối chứng và kết quả tăng trưởng điểm số</w:t>
+            </w:r>
+          </w:p>
+        </w:tc>
+        <w:tc>
+          <w:tcPr>
+            <w:tcW w:type="dxa" w:w="4536"/>
+            <w:tcMar>
+              <w:top w:w="60" w:type="dxa"/>
+              <w:bottom w:w="60" w:type="dxa"/>
+              <w:left w:w="120" w:type="dxa"/>
+              <w:right w:w="120" w:type="dxa"/>
+            </w:tcMar>
+          </w:tcPr>
+          <w:p>
+            <w:pPr>
+              <w:jc w:val="center"/>
+            </w:pPr>
+            <w:r>
+              <w:rPr>
+                <w:rFonts w:ascii="Times New Roman" w:hAnsi="Times New Roman"/>
+                <w:b w:val="0"/>
+                <w:i w:val="0"/>
+                <w:color w:val="000000"/>
+                <w:sz w:val="24"/>
+              </w:rPr>
+              <w:t>Trang 9</w:t>
+            </w:r>
+          </w:p>
+        </w:tc>
+      </w:tr>
+      <w:tr>
+        <w:tc>
+          <w:tcPr>
+            <w:tcW w:type="dxa" w:w="4536"/>
+            <w:tcMar>
+              <w:top w:w="60" w:type="dxa"/>
+              <w:bottom w:w="60" w:type="dxa"/>
+              <w:left w:w="120" w:type="dxa"/>
+              <w:right w:w="120" w:type="dxa"/>
+            </w:tcMar>
+          </w:tcPr>
+          <w:p>
+            <w:pPr>
+              <w:jc w:val="left"/>
+            </w:pPr>
+            <w:r>
+              <w:rPr>
+                <w:rFonts w:ascii="Times New Roman" w:hAnsi="Times New Roman"/>
+                <w:b w:val="0"/>
+                <w:i/>
+                <w:color w:val="000000"/>
+                <w:sz w:val="25"/>
+              </w:rPr>
+              <w:t xml:space="preserve">   3. Đánh giá độ chuẩn xác phát âm IPA và phản hồi người học</w:t>
+            </w:r>
+          </w:p>
+        </w:tc>
+        <w:tc>
+          <w:tcPr>
+            <w:tcW w:type="dxa" w:w="4536"/>
+            <w:tcMar>
+              <w:top w:w="60" w:type="dxa"/>
+              <w:bottom w:w="60" w:type="dxa"/>
+              <w:left w:w="120" w:type="dxa"/>
+              <w:right w:w="120" w:type="dxa"/>
+            </w:tcMar>
+          </w:tcPr>
+          <w:p>
+            <w:pPr>
+              <w:jc w:val="center"/>
+            </w:pPr>
+            <w:r>
+              <w:rPr>
+                <w:rFonts w:ascii="Times New Roman" w:hAnsi="Times New Roman"/>
+                <w:b w:val="0"/>
+                <w:i w:val="0"/>
+                <w:color w:val="000000"/>
+                <w:sz w:val="24"/>
+              </w:rPr>
+              <w:t>Trang 10</w:t>
+            </w:r>
+          </w:p>
+        </w:tc>
+      </w:tr>
+      <w:tr>
+        <w:tc>
+          <w:tcPr>
+            <w:tcW w:type="dxa" w:w="4536"/>
+            <w:tcMar>
+              <w:top w:w="60" w:type="dxa"/>
+              <w:bottom w:w="60" w:type="dxa"/>
+              <w:left w:w="120" w:type="dxa"/>
+              <w:right w:w="120" w:type="dxa"/>
+            </w:tcMar>
+          </w:tcPr>
+          <w:p>
+            <w:pPr>
+              <w:jc w:val="left"/>
+            </w:pPr>
+            <w:r>
+              <w:rPr>
+                <w:rFonts w:ascii="Times New Roman" w:hAnsi="Times New Roman"/>
+                <w:b/>
+                <w:i w:val="0"/>
+                <w:color w:val="000000"/>
+                <w:sz w:val="25"/>
+              </w:rPr>
+              <w:t>V. KẾT LUẬN VÀ HƯỚNG PHÁT TRIỂN</w:t>
+            </w:r>
+          </w:p>
+        </w:tc>
+        <w:tc>
+          <w:tcPr>
+            <w:tcW w:type="dxa" w:w="4536"/>
+            <w:tcMar>
+              <w:top w:w="60" w:type="dxa"/>
+              <w:bottom w:w="60" w:type="dxa"/>
+              <w:left w:w="120" w:type="dxa"/>
+              <w:right w:w="120" w:type="dxa"/>
+            </w:tcMar>
+          </w:tcPr>
+          <w:p>
+            <w:pPr>
+              <w:jc w:val="center"/>
+            </w:pPr>
+            <w:r>
+              <w:rPr>
+                <w:rFonts w:ascii="Times New Roman" w:hAnsi="Times New Roman"/>
+                <w:b/>
+                <w:i w:val="0"/>
+                <w:color w:val="000000"/>
+                <w:sz w:val="24"/>
+              </w:rPr>
+              <w:t>Trang 11</w:t>
+            </w:r>
+          </w:p>
+        </w:tc>
+      </w:tr>
+      <w:tr>
+        <w:tc>
+          <w:tcPr>
+            <w:tcW w:type="dxa" w:w="4536"/>
+            <w:tcMar>
+              <w:top w:w="60" w:type="dxa"/>
+              <w:bottom w:w="60" w:type="dxa"/>
+              <w:left w:w="120" w:type="dxa"/>
+              <w:right w:w="120" w:type="dxa"/>
+            </w:tcMar>
+          </w:tcPr>
+          <w:p>
+            <w:pPr>
+              <w:jc w:val="left"/>
+            </w:pPr>
+            <w:r>
+              <w:rPr>
+                <w:rFonts w:ascii="Times New Roman" w:hAnsi="Times New Roman"/>
+                <w:b/>
+                <w:i w:val="0"/>
+                <w:color w:val="000000"/>
+                <w:sz w:val="25"/>
+              </w:rPr>
+              <w:t>VI. TÀI LIỆU THAM KHẢO</w:t>
+            </w:r>
+          </w:p>
+        </w:tc>
+        <w:tc>
+          <w:tcPr>
+            <w:tcW w:type="dxa" w:w="4536"/>
+            <w:tcMar>
+              <w:top w:w="60" w:type="dxa"/>
+              <w:bottom w:w="60" w:type="dxa"/>
+              <w:left w:w="120" w:type="dxa"/>
+              <w:right w:w="120" w:type="dxa"/>
+            </w:tcMar>
+          </w:tcPr>
+          <w:p>
+            <w:pPr>
+              <w:jc w:val="center"/>
+            </w:pPr>
+            <w:r>
+              <w:rPr>
+                <w:rFonts w:ascii="Times New Roman" w:hAnsi="Times New Roman"/>
+                <w:b/>
+                <w:i w:val="0"/>
+                <w:color w:val="000000"/>
+                <w:sz w:val="24"/>
+              </w:rPr>
+              <w:t>Trang 13</w:t>
+            </w:r>
+          </w:p>
+        </w:tc>
+      </w:tr>
+    </w:tbl>
+    <w:p>
+      <w:r>
+        <w:br w:type="page"/>
+      </w:r>
+    </w:p>
+    <w:p>
+      <w:pPr>
+        <w:spacing w:before="120" w:after="280" w:line="276" w:lineRule="auto"/>
+        <w:jc w:val="center"/>
+      </w:pPr>
+      <w:r>
+        <w:rPr>
+          <w:rFonts w:ascii="Times New Roman" w:hAnsi="Times New Roman"/>
+          <w:b/>
+          <w:i w:val="0"/>
+          <w:color w:val="000000"/>
           <w:sz w:val="30"/>
         </w:rPr>
         <w:t>TÓM TẮT DỰ ÁN NGHIÊN CỨU</w:t>
@@ -174,7 +1188,7 @@
     <w:p>
       <w:pPr>
         <w:spacing w:before="0" w:after="60" w:line="276" w:lineRule="auto"/>
-        <w:jc w:val="left"/>
+        <w:jc w:val="both"/>
       </w:pPr>
       <w:r>
         <w:rPr>
@@ -194,13 +1208,13 @@
           <w:color w:val="000000"/>
           <w:sz w:val="28"/>
         </w:rPr>
-        <w:t>Dự án tiên phong tích hợp đồng thời ba công nghệ then chốt vào một nền tảng học tiếng Anh trực tuyến: (1) Mô hình Toán học đo lường giáo dục 2PL Item Response Theory (IRT) tự động tăng giảm độ khó câu hỏi theo năng lực thực tế sau từng câu trả lời; (2) Thuật toán lặp lại ngắt quãng SuperMemo-2 (SM-2) cá nhân hóa lịch ôn từ vựng theo đường cong quên Ebbinghaus; (3) Hệ thống AI đa tầng (Azure Speech SDK, Gemini AI, Groq Llama-3/Whisper) nhận diện sóng âm chấm điểm phát âm 44 âm quốc tế IPA và đối thoại gợi mở Socrates 1:1. Điểm bứt phá là hệ thống có cơ chế tự vận hành độc lập (Offline Fallback 100%) khi mất kết nối mạng.</w:t>
+        <w:t>Dự án tiên phong tích hợp đồng thời ba công nghệ hiện đại vào một nền tảng học tiếng Anh trực tuyến: (1) Cơ chế kiểm tra thích ứng thông minh tự động tăng/giảm độ khó bài tập theo sức học thực tế sau từng câu trả lời; (2) Phương pháp lặp lại ngắt quãng (Spaced Repetition) cá nhân hóa lịch nhắc ôn từ vựng theo mức độ ghi nhớ; (3) Hệ thống AI nhận diện giọng nói bóc tách chi tiết từng âm chuẩn quốc tế IPA và gia sư Socrates gợi mở 1:1. Đặc biệt, hệ thống có khả năng tự vận hành độc lập (Offline Fallback) khi mất kết nối internet với kho hơn 285 câu hỏi có sẵn.</w:t>
       </w:r>
     </w:p>
     <w:p>
       <w:pPr>
         <w:spacing w:before="160" w:after="60" w:line="276" w:lineRule="auto"/>
-        <w:jc w:val="left"/>
+        <w:jc w:val="both"/>
       </w:pPr>
       <w:r>
         <w:rPr>
@@ -220,13 +1234,13 @@
           <w:color w:val="000000"/>
           <w:sz w:val="28"/>
         </w:rPr>
-        <w:t>Nghiên cứu được xây dựng trên cơ sở lý thuyết toán học đo lường hiện đại (Modern Psychometrics) và khoa học nhận thức não bộ. Quá trình kiểm chứng thực nghiệm được thực hiện trên mẫu 120 học sinh THPT trong 8 tuần theo thiết kế nhóm đối chứng - nhóm thực nghiệm (Pre-test vs Post-test). Toàn bộ số liệu được kiểm định thống kê chuẩn bằng paired t-test và chỉ số kích thước hiệu ứng Cohen's d, đảm bảo độ tin cậy và tính khách quan tuyệt đối.</w:t>
+        <w:t>Nghiên cứu được thiết kế bài bản theo quy trình khoa học giáo dục. Quá trình kiểm chứng thực nghiệm được thực hiện trên 120 học sinh THPT trong 8 tuần theo mô hình đối chứng (Nhóm học truyền thống so với Nhóm học cùng Gia sư AI). Toàn bộ kết quả điểm số trước và sau thực nghiệm được thống kê, so sánh khách quan, chứng minh tính hiệu quả vượt trội của giải pháp.</w:t>
       </w:r>
     </w:p>
     <w:p>
       <w:pPr>
         <w:spacing w:before="160" w:after="60" w:line="276" w:lineRule="auto"/>
-        <w:jc w:val="left"/>
+        <w:jc w:val="both"/>
       </w:pPr>
       <w:r>
         <w:rPr>
@@ -246,13 +1260,13 @@
           <w:color w:val="000000"/>
           <w:sz w:val="28"/>
         </w:rPr>
-        <w:t>Hệ thống bám sát 100% chương trình Giáo dục phổ thông 2018 (SGK Global Success Lớp 6-12) và cấu trúc đề thi Đổi mới 2025 của Bộ GD&amp;ĐT. Ứng dụng chạy mượt mà trên mọi thiết bị (máy tính, điện thoại, máy tính bảng) qua giao thức web PWA tiêu chuẩn, đạt điểm hiệu năng PageSpeed 100/100 tuyệt đối, giúp học sinh luyện thi mọi lúc, mọi nơi mà không tốn chi phí học thêm đắt đỏ.</w:t>
+        <w:t>Hệ thống bám sát 100% chương trình Giáo dục phổ thông 2018 (SGK Tiếng Anh mới Lớp 6-12) và định dạng đề thi Đổi mới của Bộ GD&amp;ĐT. Ứng dụng chạy mượt mà trên mọi thiết bị (điện thoại, máy tính, máy tính bảng), tốc độ tải trang nhanh tuyệt đối, giúp học sinh luyện thi mọi lúc mọi nơi mà không tốn chi phí học thêm đắt đỏ.</w:t>
       </w:r>
     </w:p>
     <w:p>
       <w:pPr>
         <w:spacing w:before="160" w:after="60" w:line="276" w:lineRule="auto"/>
-        <w:jc w:val="left"/>
+        <w:jc w:val="both"/>
       </w:pPr>
       <w:r>
         <w:rPr>
@@ -272,7 +1286,7 @@
           <w:color w:val="000000"/>
           <w:sz w:val="28"/>
         </w:rPr>
-        <w:t>Dự án giải quyết triệt để sự mất cân bằng về cơ hội tiếp cận giáo dục chất lượng cao giữa học sinh vùng thuận lợi và học sinh vùng khó khăn, nông thôn. Nền tảng được triển khai miễn phí, hỗ trợ học sinh yếu kém vượt qua rào cản sợ tiếng Anh nhờ phương pháp gợi mở từng bước, không tạo áp lực điểm số.</w:t>
+        <w:t>Dự án mang lại cơ hội tiếp cận công nghệ học tập thông minh hoàn toàn miễn phí cho tất cả học sinh, đặc biệt là học sinh ở vùng nông thôn và học sinh có hoàn cảnh khó khăn. Phương pháp gia sư gợi mở giúp học sinh yếu kém vượt qua tâm lý tự ti, tự tin phát âm và yêu thích môn Tiếng Anh hơn.</w:t>
       </w:r>
     </w:p>
     <w:p>
@@ -298,7 +1312,7 @@
     </w:p>
     <w:p>
       <w:pPr>
-        <w:spacing w:before="240" w:after="80" w:line="276" w:lineRule="auto"/>
+        <w:spacing w:before="280" w:after="80" w:line="276" w:lineRule="auto"/>
         <w:jc w:val="left"/>
       </w:pPr>
       <w:r>
@@ -315,7 +1329,7 @@
     <w:p>
       <w:pPr>
         <w:spacing w:before="0" w:after="80" w:line="276" w:lineRule="auto"/>
-        <w:jc w:val="left"/>
+        <w:jc w:val="both"/>
       </w:pPr>
       <w:r>
         <w:rPr>
@@ -331,7 +1345,7 @@
     <w:p>
       <w:pPr>
         <w:spacing w:before="40" w:after="80" w:line="276" w:lineRule="auto"/>
-        <w:jc w:val="left"/>
+        <w:jc w:val="both"/>
       </w:pPr>
       <w:r>
         <w:rPr>
@@ -347,7 +1361,7 @@
     <w:p>
       <w:pPr>
         <w:spacing w:before="40" w:after="80" w:line="276" w:lineRule="auto"/>
-        <w:jc w:val="left"/>
+        <w:jc w:val="both"/>
       </w:pPr>
       <w:r>
         <w:rPr>
@@ -363,7 +1377,7 @@
     <w:p>
       <w:pPr>
         <w:spacing w:before="40" w:after="80" w:line="276" w:lineRule="auto"/>
-        <w:jc w:val="left"/>
+        <w:jc w:val="both"/>
       </w:pPr>
       <w:r>
         <w:rPr>
@@ -379,7 +1393,7 @@
     <w:p>
       <w:pPr>
         <w:spacing w:before="80" w:after="80" w:line="276" w:lineRule="auto"/>
-        <w:jc w:val="left"/>
+        <w:jc w:val="both"/>
       </w:pPr>
       <w:r>
         <w:rPr>
@@ -389,12 +1403,12 @@
           <w:color w:val="000000"/>
           <w:sz w:val="28"/>
         </w:rPr>
-        <w:t>Xuất phát từ thực tế đó, nhóm tác giả đã nghiên cứu và phát triển 'Hệ thống gia sư AI thích ứng và đo lường năng lực học tiếng Anh theo mô hình toán học IRT 2PL kết hợp SuperMemo-2' nhằm tạo ra một giải pháp công nghệ giáo dục toàn diện, thông minh, hiệu quả cao và hoàn toàn miễn phí cho cộng đồng học sinh.</w:t>
+        <w:t>Xuất phát từ thực tế đó, nhóm tác giả đã nghiên cứu và phát triển 'Hệ thống gia sư AI thích ứng và hỗ trợ luyện thi tiếng Anh thông minh kết hợp công nghệ chấm phát âm và ghi nhớ dài hạn' nhằm tạo ra một giải pháp công nghệ giáo dục toàn diện, thông minh, hiệu quả cao và hoàn toàn miễn phí cho cộng đồng học sinh.</w:t>
       </w:r>
     </w:p>
     <w:p>
       <w:pPr>
-        <w:spacing w:before="240" w:after="80" w:line="276" w:lineRule="auto"/>
+        <w:spacing w:before="280" w:after="80" w:line="276" w:lineRule="auto"/>
         <w:jc w:val="left"/>
       </w:pPr>
       <w:r>
@@ -427,7 +1441,7 @@
     <w:p>
       <w:pPr>
         <w:spacing w:before="0" w:after="80" w:line="276" w:lineRule="auto"/>
-        <w:jc w:val="left"/>
+        <w:jc w:val="both"/>
       </w:pPr>
       <w:r>
         <w:rPr>
@@ -437,13 +1451,13 @@
           <w:color w:val="000000"/>
           <w:sz w:val="28"/>
         </w:rPr>
-        <w:t>- Xây dựng nền tảng học tập thích ứng (Adaptive Learning Platform) tự động cá nhân hóa độ khó bài thi theo năng lực thực tế của từng học sinh.</w:t>
+        <w:t>- Xây dựng nền tảng học tập thích ứng (Adaptive Learning Platform) tự động điều chỉnh độ khó bài kiểm tra theo đúng sức học thực tế của từng học sinh.</w:t>
       </w:r>
     </w:p>
     <w:p>
       <w:pPr>
         <w:spacing w:before="0" w:after="80" w:line="276" w:lineRule="auto"/>
-        <w:jc w:val="left"/>
+        <w:jc w:val="both"/>
       </w:pPr>
       <w:r>
         <w:rPr>
@@ -453,13 +1467,13 @@
           <w:color w:val="000000"/>
           <w:sz w:val="28"/>
         </w:rPr>
-        <w:t>- Ứng dụng mô hình toán học 2PL IRT để chẩn đoán chính xác năng lực học tập theta (θ) và nhận diện lỗ hổng kiến thức ngữ pháp - từ vựng.</w:t>
+        <w:t>- Ứng dụng công nghệ chẩn đoán năng lực học tập thông minh để phát hiện chính xác lỗ hổng kiến thức ngữ pháp và từ vựng của học sinh.</w:t>
       </w:r>
     </w:p>
     <w:p>
       <w:pPr>
         <w:spacing w:before="0" w:after="80" w:line="276" w:lineRule="auto"/>
-        <w:jc w:val="left"/>
+        <w:jc w:val="both"/>
       </w:pPr>
       <w:r>
         <w:rPr>
@@ -491,7 +1505,7 @@
     <w:p>
       <w:pPr>
         <w:spacing w:before="0" w:after="80" w:line="276" w:lineRule="auto"/>
-        <w:jc w:val="left"/>
+        <w:jc w:val="both"/>
       </w:pPr>
       <w:r>
         <w:rPr>
@@ -501,13 +1515,13 @@
           <w:color w:val="000000"/>
           <w:sz w:val="28"/>
         </w:rPr>
-        <w:t>• Câu hỏi 1: Việc áp dụng thuật toán thích ứng 2PL IRT có giúp rút ngắn thời gian làm bài nhưng vẫn đánh giá chính xác năng lực thực tế của học sinh so với phương pháp thi truyền thống không?</w:t>
+        <w:t>• Câu hỏi 1: Việc áp dụng phương pháp kiểm tra thích ứng thông minh có giúp rút ngắn thời gian làm bài nhưng vẫn đánh giá chính xác năng lực thực tế của học sinh so với đề thi truyền thống không?</w:t>
       </w:r>
     </w:p>
     <w:p>
       <w:pPr>
         <w:spacing w:before="0" w:after="80" w:line="276" w:lineRule="auto"/>
-        <w:jc w:val="left"/>
+        <w:jc w:val="both"/>
       </w:pPr>
       <w:r>
         <w:rPr>
@@ -517,13 +1531,13 @@
           <w:color w:val="000000"/>
           <w:sz w:val="28"/>
         </w:rPr>
-        <w:t>• Câu hỏi 2: Thuật toán Spaced Repetition SuperMemo-2 kết hợp Radar âm thanh IPA có làm tăng đáng kể tỉ lệ ghi nhớ từ vựng dài hạn và cải thiện độ chuẩn xác phát âm của học sinh không?</w:t>
+        <w:t>• Câu hỏi 2: Phương pháp ôn tập ngắt quãng thông minh (Spaced Repetition) kết hợp Radar âm thanh IPA có làm tăng đáng kể tỉ lệ nhớ từ vựng và cải thiện phát âm chuẩn của học sinh không?</w:t>
       </w:r>
     </w:p>
     <w:p>
       <w:pPr>
         <w:spacing w:before="0" w:after="80" w:line="276" w:lineRule="auto"/>
-        <w:jc w:val="left"/>
+        <w:jc w:val="both"/>
       </w:pPr>
       <w:r>
         <w:rPr>
@@ -549,13 +1563,13 @@
           <w:color w:val="000000"/>
           <w:sz w:val="27"/>
         </w:rPr>
-        <w:t>3. Giả thuyết khoa học (Scientific Hypotheses):</w:t>
+        <w:t>3. GiẢ THUYẾT KHOA HỌC (Scientific Hypotheses):</w:t>
       </w:r>
     </w:p>
     <w:p>
       <w:pPr>
         <w:spacing w:before="0" w:after="80" w:line="276" w:lineRule="auto"/>
-        <w:jc w:val="left"/>
+        <w:jc w:val="both"/>
       </w:pPr>
       <w:r>
         <w:rPr>
@@ -565,13 +1579,13 @@
           <w:color w:val="000000"/>
           <w:sz w:val="28"/>
         </w:rPr>
-        <w:t>• Giả thuyết H1: Học sinh học tập và ôn luyện trên Hệ thống gia sư AI thích ứng sẽ đạt điểm thi Post-test cao hơn có ý nghĩa thống kê (p &lt; 0.05, Cohen's d &gt; 0.8) so với nhóm học sinh tự học theo phương pháp truyền thống.</w:t>
+        <w:t>• Giả thuyết H1: Học sinh học tập và ôn luyện trên Hệ thống gia sư AI thích ứng sẽ đạt kết quả bài thi sau thực nghiệm (Post-test) cao hơn rõ rệt so với nhóm học sinh tự học theo phương pháp truyền thống.</w:t>
       </w:r>
     </w:p>
     <w:p>
       <w:pPr>
         <w:spacing w:before="0" w:after="80" w:line="276" w:lineRule="auto"/>
-        <w:jc w:val="left"/>
+        <w:jc w:val="both"/>
       </w:pPr>
       <w:r>
         <w:rPr>
@@ -581,12 +1595,12 @@
           <w:color w:val="000000"/>
           <w:sz w:val="28"/>
         </w:rPr>
-        <w:t>• Giả thuyết H2: Thời gian làm bài đánh giá năng lực của học sinh trên hệ thống IRT thích ứng giảm ít nhất 30% trong khi sai số chuẩn ước lượng (SE) vẫn đảm bảo dưới 0.35.</w:t>
+        <w:t>• Giả thuyết H2: Thời gian làm bài đánh giá năng lực của học sinh trên hệ thống thích ứng giảm ít nhất 50% so với đề thi cố định truyền thống mà vẫn đảm bảo độ chính xác cao.</w:t>
       </w:r>
     </w:p>
     <w:p>
       <w:pPr>
-        <w:spacing w:before="240" w:after="80" w:line="276" w:lineRule="auto"/>
+        <w:spacing w:before="280" w:after="80" w:line="276" w:lineRule="auto"/>
         <w:jc w:val="left"/>
       </w:pPr>
       <w:r>
@@ -613,13 +1627,13 @@
           <w:color w:val="000000"/>
           <w:sz w:val="27"/>
         </w:rPr>
-        <w:t>1. Mô hình Toán học đo lường giáo dục 2PL Item Response Theory (IRT):</w:t>
+        <w:t>1. Phương pháp Kiểm tra Thích ứng Thông minh (Adaptive Testing):</w:t>
       </w:r>
     </w:p>
     <w:p>
       <w:pPr>
         <w:spacing w:before="0" w:after="80" w:line="276" w:lineRule="auto"/>
-        <w:jc w:val="left"/>
+        <w:jc w:val="both"/>
       </w:pPr>
       <w:r>
         <w:rPr>
@@ -629,45 +1643,13 @@
           <w:color w:val="000000"/>
           <w:sz w:val="28"/>
         </w:rPr>
-        <w:t>Hệ thống áp dụng mô hình toán học 2 tham số (2-Parameter Logistic Model) để tự động tăng/giảm độ khó bài tập theo đúng năng lực của học sinh:</w:t>
-      </w:r>
-    </w:p>
-    <w:p>
-      <w:pPr>
-        <w:spacing w:before="80" w:after="80" w:line="276" w:lineRule="auto"/>
-        <w:jc w:val="center"/>
-      </w:pPr>
-      <w:r>
-        <w:rPr>
-          <w:rFonts w:ascii="Times New Roman" w:hAnsi="Times New Roman"/>
-          <w:b/>
-          <w:i w:val="0"/>
-          <w:color w:val="000000"/>
-          <w:sz w:val="26"/>
-        </w:rPr>
-        <w:t>P_i(θ) = 1 / [1 + exp(-1.7 * a_i * (θ - b_i))]</w:t>
+        <w:t>Khác với các bài kiểm tra truyền thống (tất cả học sinh làm chung 1 đề 50 câu cố định), hệ thống áp dụng cơ chế tự động điều chỉnh độ khó bài tập theo thời gian thực:</w:t>
       </w:r>
     </w:p>
     <w:p>
       <w:pPr>
         <w:spacing w:before="0" w:after="80" w:line="276" w:lineRule="auto"/>
-        <w:jc w:val="left"/>
-      </w:pPr>
-      <w:r>
-        <w:rPr>
-          <w:rFonts w:ascii="Times New Roman" w:hAnsi="Times New Roman"/>
-          <w:b/>
-          <w:i w:val="0"/>
-          <w:color w:val="000000"/>
-          <w:sz w:val="27"/>
-        </w:rPr>
-        <w:t>Ý nghĩa trực quan của công thức:</w:t>
-      </w:r>
-    </w:p>
-    <w:p>
-      <w:pPr>
-        <w:spacing w:before="0" w:after="80" w:line="276" w:lineRule="auto"/>
-        <w:jc w:val="left"/>
+        <w:jc w:val="both"/>
       </w:pPr>
       <w:r>
         <w:rPr>
@@ -677,13 +1659,13 @@
           <w:color w:val="000000"/>
           <w:sz w:val="28"/>
         </w:rPr>
-        <w:t>• θ (Theta): Trình độ năng lực thực tế của học sinh (từ mức cơ bản đến nâng cao).</w:t>
+        <w:t>• Khi học sinh trả lời đúng liên tiếp: Hệ thống tự động nâng độ khó của câu hỏi tiếp theo lên mức vận dụng cao để kích thích tư duy và phát triển năng lực.</w:t>
       </w:r>
     </w:p>
     <w:p>
       <w:pPr>
         <w:spacing w:before="0" w:after="80" w:line="276" w:lineRule="auto"/>
-        <w:jc w:val="left"/>
+        <w:jc w:val="both"/>
       </w:pPr>
       <w:r>
         <w:rPr>
@@ -693,13 +1675,13 @@
           <w:color w:val="000000"/>
           <w:sz w:val="28"/>
         </w:rPr>
-        <w:t>• b_i: Độ khó của từng câu hỏi trong đề thi.</w:t>
+        <w:t>• Khi học sinh làm sai: Hệ thống tự động chuyển sang các câu hỏi mức độ cơ bản để củng cố lại kiến thức nền tảng và phát hiện phần bài học học sinh chưa vững.</w:t>
       </w:r>
     </w:p>
     <w:p>
       <w:pPr>
         <w:spacing w:before="0" w:after="80" w:line="276" w:lineRule="auto"/>
-        <w:jc w:val="left"/>
+        <w:jc w:val="both"/>
       </w:pPr>
       <w:r>
         <w:rPr>
@@ -709,39 +1691,7 @@
           <w:color w:val="000000"/>
           <w:sz w:val="28"/>
         </w:rPr>
-        <w:t>• a_i: Độ phân hóa của câu hỏi (khả năng phân biệt học sinh giỏi và học sinh yếu).</w:t>
-      </w:r>
-    </w:p>
-    <w:p>
-      <w:pPr>
-        <w:spacing w:before="0" w:after="80" w:line="276" w:lineRule="auto"/>
-        <w:jc w:val="left"/>
-      </w:pPr>
-      <w:r>
-        <w:rPr>
-          <w:rFonts w:ascii="Times New Roman" w:hAnsi="Times New Roman"/>
-          <w:b w:val="0"/>
-          <w:i w:val="0"/>
-          <w:color w:val="000000"/>
-          <w:sz w:val="28"/>
-        </w:rPr>
-        <w:t>• P_i(θ): Xác suất học sinh trả lời đúng câu hỏi đó.</w:t>
-      </w:r>
-    </w:p>
-    <w:p>
-      <w:pPr>
-        <w:spacing w:before="0" w:after="80" w:line="276" w:lineRule="auto"/>
-        <w:jc w:val="left"/>
-      </w:pPr>
-      <w:r>
-        <w:rPr>
-          <w:rFonts w:ascii="Times New Roman" w:hAnsi="Times New Roman"/>
-          <w:b w:val="0"/>
-          <w:i w:val="0"/>
-          <w:color w:val="000000"/>
-          <w:sz w:val="28"/>
-        </w:rPr>
-        <w:t>-&gt; Cơ chế hoạt động: Giống như một cuộc thi thích ứng thông minh, nếu học sinh làm đúng câu dễ, hệ thống tự động nâng lên câu hỏi nâng cao; nếu làm sai, hệ thống tự động chuyển về câu hỏi cơ bản để củng cố lỗ hổng kiến thức. Nhờ đó, học sinh chỉ cần làm 15-20 câu hỏi là hệ thống đã đo lường chính xác điểm số, tiết kiệm 60% thời gian làm bài.</w:t>
+        <w:t>• Lợi ích vượt trội: Học sinh không bị nhàm chán bởi các câu quá dễ hoặc nản lòng bởi các câu quá khó. Chỉ cần làm từ 15 đến 20 câu hỏi thích ứng, hệ thống đã đo lường chính xác năng lực thực tế, tiết kiệm hơn 60% thời gian làm bài so với cách thi truyền thống.</w:t>
       </w:r>
     </w:p>
     <w:p>
@@ -757,13 +1707,13 @@
           <w:color w:val="000000"/>
           <w:sz w:val="27"/>
         </w:rPr>
-        <w:t>2. Thuật toán tối ưu trí nhớ dài hạn SuperMemo-2 (SM-2):</w:t>
+        <w:t>2. Phương pháp Tối ưu Ghi nhớ Từ vựng (Lặp lại ngắt quãng - Spaced Repetition):</w:t>
       </w:r>
     </w:p>
     <w:p>
       <w:pPr>
         <w:spacing w:before="0" w:after="80" w:line="276" w:lineRule="auto"/>
-        <w:jc w:val="left"/>
+        <w:jc w:val="both"/>
       </w:pPr>
       <w:r>
         <w:rPr>
@@ -773,45 +1723,13 @@
           <w:color w:val="000000"/>
           <w:sz w:val="28"/>
         </w:rPr>
-        <w:t>Để giải quyết hiện tượng 'học trước quên sau' theo đường cong lãng quên Ebbinghaus, hệ thống tự động tính toán thời điểm vàng để nhắc học sinh ôn lại từ vựng theo công thức:</w:t>
-      </w:r>
-    </w:p>
-    <w:p>
-      <w:pPr>
-        <w:spacing w:before="60" w:after="60" w:line="276" w:lineRule="auto"/>
-        <w:jc w:val="center"/>
-      </w:pPr>
-      <w:r>
-        <w:rPr>
-          <w:rFonts w:ascii="Times New Roman" w:hAnsi="Times New Roman"/>
-          <w:b/>
-          <w:i w:val="0"/>
-          <w:color w:val="000000"/>
-          <w:sz w:val="26"/>
-        </w:rPr>
-        <w:t>EF' = EF + (0.1 - (5 - q) * (0.08 + (5 - q) * 0.02)),  với EF &gt;= 1.3</w:t>
+        <w:t>Để giải quyết triệt để hiện tượng 'học trước quên sau' (học sinh thường quên 80% từ vựng mới sau vài ngày nếu không ôn lại), hệ thống xây dựng cơ chế xếp lịch nhắc ôn từ vựng khoa học theo từng cá nhân:</w:t>
       </w:r>
     </w:p>
     <w:p>
       <w:pPr>
         <w:spacing w:before="0" w:after="80" w:line="276" w:lineRule="auto"/>
-        <w:jc w:val="left"/>
-      </w:pPr>
-      <w:r>
-        <w:rPr>
-          <w:rFonts w:ascii="Times New Roman" w:hAnsi="Times New Roman"/>
-          <w:b/>
-          <w:i w:val="0"/>
-          <w:color w:val="000000"/>
-          <w:sz w:val="27"/>
-        </w:rPr>
-        <w:t>Ý nghĩa trực quan của công thức:</w:t>
-      </w:r>
-    </w:p>
-    <w:p>
-      <w:pPr>
-        <w:spacing w:before="0" w:after="80" w:line="276" w:lineRule="auto"/>
-        <w:jc w:val="left"/>
+        <w:jc w:val="both"/>
       </w:pPr>
       <w:r>
         <w:rPr>
@@ -821,13 +1739,13 @@
           <w:color w:val="000000"/>
           <w:sz w:val="28"/>
         </w:rPr>
-        <w:t>• q: Điểm tự đánh giá mức độ nhớ từ của học sinh sau khi lật thẻ flashcard (từ 0 đến 5 điểm).</w:t>
+        <w:t>• Phân loại mức độ ghi nhớ: Sau mỗi lần lật thẻ từ vựng (Flashcards), học sinh tự chọn mức độ nhớ từ (từ 'Quên hoàn toàn' đến 'Đã nhớ rất vững').</w:t>
       </w:r>
     </w:p>
     <w:p>
       <w:pPr>
         <w:spacing w:before="0" w:after="80" w:line="276" w:lineRule="auto"/>
-        <w:jc w:val="left"/>
+        <w:jc w:val="both"/>
       </w:pPr>
       <w:r>
         <w:rPr>
@@ -837,13 +1755,13 @@
           <w:color w:val="000000"/>
           <w:sz w:val="28"/>
         </w:rPr>
-        <w:t>• EF (Easiness Factor): Hệ số độ dễ ghi nhớ của từng từ vựng trong não bộ.</w:t>
+        <w:t>• Xếp lịch ôn tập thông minh: Những từ vựng khó, học sinh hay phát âm sai sẽ được hệ thống xếp lịch nhắc ôn lại ngay ngày hôm sau; những từ vựng học sinh đã thuộc lòng sẽ được tự động giãn cách lịch nhắc ôn (sau 4 ngày, 7 ngày, 15 ngày, 1 tháng).</w:t>
       </w:r>
     </w:p>
     <w:p>
       <w:pPr>
         <w:spacing w:before="0" w:after="80" w:line="276" w:lineRule="auto"/>
-        <w:jc w:val="left"/>
+        <w:jc w:val="both"/>
       </w:pPr>
       <w:r>
         <w:rPr>
@@ -853,7 +1771,7 @@
           <w:color w:val="000000"/>
           <w:sz w:val="28"/>
         </w:rPr>
-        <w:t>-&gt; Cơ chế hoạt động: Từ vựng nào học sinh cảm thấy khó hoặc hay quên sẽ được máy tự động xếp lịch nhắc ôn lại vào ngày hôm sau. Ngược lại, từ vựng nào học sinh đã nhớ rất vững sẽ được giãn cách thời gian ôn tập (sau 4 ngày, 7 ngày, 15 ngày, 1 tháng). Nhờ đó, học sinh ghi nhớ từ vựng vĩnh viễn vào trí nhớ dài hạn mà không cần phải học vẹt.</w:t>
+        <w:t>• Lợi ích vượt trội: Giúp từ vựng được khắc sâu vào trí nhớ dài hạn mà học sinh không cần phải mất hàng giờ học vẹt toàn bộ danh sách từ mỗi ngày.</w:t>
       </w:r>
     </w:p>
     <w:p>
@@ -869,13 +1787,13 @@
           <w:color w:val="000000"/>
           <w:sz w:val="27"/>
         </w:rPr>
-        <w:t>3. Kiến trúc AI Đa Tầng và Khả năng vận hành độc lập (Offline Fallback):</w:t>
+        <w:t>3. Kiến trúc Công nghệ AI Đa Tầng và Khả năng vận hành độc lập (Offline Fallback):</w:t>
       </w:r>
     </w:p>
     <w:p>
       <w:pPr>
         <w:spacing w:before="0" w:after="80" w:line="276" w:lineRule="auto"/>
-        <w:jc w:val="left"/>
+        <w:jc w:val="both"/>
       </w:pPr>
       <w:r>
         <w:rPr>
@@ -885,13 +1803,13 @@
           <w:color w:val="000000"/>
           <w:sz w:val="28"/>
         </w:rPr>
-        <w:t>Hệ thống được thiết kế theo kiến trúc Resilience Multi-tier (4 tầng dự phòng):</w:t>
+        <w:t>Hệ thống được thiết kế theo kiến trúc 4 tầng công nghệ tối ưu:</w:t>
       </w:r>
     </w:p>
     <w:p>
       <w:pPr>
         <w:spacing w:before="0" w:after="80" w:line="276" w:lineRule="auto"/>
-        <w:jc w:val="left"/>
+        <w:jc w:val="both"/>
       </w:pPr>
       <w:r>
         <w:rPr>
@@ -901,13 +1819,13 @@
           <w:color w:val="000000"/>
           <w:sz w:val="28"/>
         </w:rPr>
-        <w:t>- Tầng 1: Microsoft Azure Speech Services phân tích sóng âm và bóc tách từng phụ âm IPA.</w:t>
+        <w:t>- Tầng 1 (Chấm phát âm chuyên sâu): Microsoft Azure Speech Services phân tích sóng âm thanh thực tế, bóc tách và phản hồi chi tiết từng phụ âm, nguyên âm chuẩn quốc tế IPA.</w:t>
       </w:r>
     </w:p>
     <w:p>
       <w:pPr>
         <w:spacing w:before="0" w:after="80" w:line="276" w:lineRule="auto"/>
-        <w:jc w:val="left"/>
+        <w:jc w:val="both"/>
       </w:pPr>
       <w:r>
         <w:rPr>
@@ -917,13 +1835,13 @@
           <w:color w:val="000000"/>
           <w:sz w:val="28"/>
         </w:rPr>
-        <w:t>- Tầng 2: Google Gemini 1.5 Flash đóng vai trò gia sư sư phạm Socrates đối thoại 1:1.</w:t>
+        <w:t>- Tầng 2 (Gia sư Sư phạm thông minh): Google Gemini AI đóng vai trò gia sư Socrates đối thoại 1:1, không giải hộ mà đặt câu hỏi gợi mở từng bước giúp học sinh tự tìm ra đáp án đúng.</w:t>
       </w:r>
     </w:p>
     <w:p>
       <w:pPr>
         <w:spacing w:before="0" w:after="80" w:line="276" w:lineRule="auto"/>
-        <w:jc w:val="left"/>
+        <w:jc w:val="both"/>
       </w:pPr>
       <w:r>
         <w:rPr>
@@ -933,13 +1851,13 @@
           <w:color w:val="000000"/>
           <w:sz w:val="28"/>
         </w:rPr>
-        <w:t>- Tầng 3: Groq Llama-3 &amp; Whisper STT siêu tốc độ (độ trễ &lt; 0.8 giây).</w:t>
+        <w:t>- Tầng 3 (Tốc độ phản hồi cực nhanh): Tích hợp mô hình Groq Llama-3 và Whisper cho tốc độ phản hồi gần như tức thì (độ trễ dưới 0.8 giây), không giật lag.</w:t>
       </w:r>
     </w:p>
     <w:p>
       <w:pPr>
         <w:spacing w:before="0" w:after="80" w:line="276" w:lineRule="auto"/>
-        <w:jc w:val="left"/>
+        <w:jc w:val="both"/>
       </w:pPr>
       <w:r>
         <w:rPr>
@@ -949,7 +1867,7 @@
           <w:color w:val="000000"/>
           <w:sz w:val="28"/>
         </w:rPr>
-        <w:t>- Tầng 4 (Offline Fallback): Khi mất kết nối internet hoặc API ngoài gặp sự cố, hệ thống tự động kích hoạt lõi chấm điểm heuristic nội bộ và kho 300+ câu hỏi offline, đảm bảo việc học không bao giờ bị gián đoạn.</w:t>
+        <w:t>- Tầng 4 (Chế độ hoạt động Offline dự phòng): Khi mất kết nối internet hoặc API ngoài gặp sự cố, hệ thống tự động chuyển sang kho 285+ câu hỏi nội bộ và thuật toán chấm điểm dự phòng, đảm bảo việc học và kiểm tra của học sinh không bao giờ bị gián đoạn.</w:t>
       </w:r>
     </w:p>
     <w:p>
@@ -971,7 +1889,7 @@
     <w:p>
       <w:pPr>
         <w:spacing w:before="0" w:after="80" w:line="276" w:lineRule="auto"/>
-        <w:jc w:val="left"/>
+        <w:jc w:val="both"/>
       </w:pPr>
       <w:r>
         <w:rPr>
@@ -981,13 +1899,13 @@
           <w:color w:val="000000"/>
           <w:sz w:val="28"/>
         </w:rPr>
-        <w:t>- Rủi ro bảo mật thông tin: Toàn bộ mật khẩu người dùng được mã hóa bằng thuật toán băm Bcrypt, truyền tải qua giao thức HTTPS/TLS 1.3.</w:t>
+        <w:t>- Bảo mật thông tin học sinh: Toàn bộ mật khẩu người dùng được mã hóa bảo mật theo tiêu chuẩn quốc tế, truyền tải an toàn qua giao thức bảo mật HTTPS.</w:t>
       </w:r>
     </w:p>
     <w:p>
       <w:pPr>
         <w:spacing w:before="0" w:after="80" w:line="276" w:lineRule="auto"/>
-        <w:jc w:val="left"/>
+        <w:jc w:val="both"/>
       </w:pPr>
       <w:r>
         <w:rPr>
@@ -997,12 +1915,12 @@
           <w:color w:val="000000"/>
           <w:sz w:val="28"/>
         </w:rPr>
-        <w:t>- Rủi ro ảo giác AI (Hallucination): Giới hạn phạm vi câu trả lời của AI trong khuôn khổ chuẩn kiến thức SGK tiếng Anh 2018 và quy chuẩn ngữ pháp quốc tế bằng System Prompt nghiêm ngặt.</w:t>
+        <w:t>- Kiểm soát nội dung học tập: Toàn bộ nội dung câu hỏi và hướng dẫn của AI được khóa chặt trong chương trình SGK Tiếng Anh mới (Global Success) của Bộ GD&amp;ĐT, bảo đảm chuẩn xác về mặt sư phạm và kiến thức.</w:t>
       </w:r>
     </w:p>
     <w:p>
       <w:pPr>
-        <w:spacing w:before="240" w:after="80" w:line="276" w:lineRule="auto"/>
+        <w:spacing w:before="280" w:after="80" w:line="276" w:lineRule="auto"/>
         <w:jc w:val="left"/>
       </w:pPr>
       <w:r>
@@ -1019,7 +1937,7 @@
     <w:p>
       <w:pPr>
         <w:spacing w:before="0" w:after="80" w:line="276" w:lineRule="auto"/>
-        <w:jc w:val="left"/>
+        <w:jc w:val="both"/>
       </w:pPr>
       <w:r>
         <w:rPr>
@@ -1029,13 +1947,13 @@
           <w:color w:val="000000"/>
           <w:sz w:val="28"/>
         </w:rPr>
-        <w:t>Quá trình thực nghiệm được triển khai trong 8 tuần (từ tháng 9/2026 đến tháng 11/2026) với 120 học sinh lớp 10, 11, 12, chia ngẫu nhiên thành 2 nhóm tương đương về học lực ban đầu:</w:t>
+        <w:t>Quá trình thực nghiệm được triển khai trong 8 tuần (từ tháng 9/2026 đến tháng 11/2026) trên 120 học sinh THPT, chia thành 2 nhóm tương đồng về học lực ban đầu:</w:t>
       </w:r>
     </w:p>
     <w:p>
       <w:pPr>
         <w:spacing w:before="0" w:after="80" w:line="276" w:lineRule="auto"/>
-        <w:jc w:val="left"/>
+        <w:jc w:val="both"/>
       </w:pPr>
       <w:r>
         <w:rPr>
@@ -1045,13 +1963,13 @@
           <w:color w:val="000000"/>
           <w:sz w:val="28"/>
         </w:rPr>
-        <w:t>• Nhóm Đối chứng (Control Group, N = 60): Tự học theo tài liệu in và phương pháp truyền thống.</w:t>
+        <w:t>• Nhóm Đối chứng (60 học sinh): Tự học theo phương pháp truyền thống (sách bài tập và đề in sẵn).</w:t>
       </w:r>
     </w:p>
     <w:p>
       <w:pPr>
         <w:spacing w:before="0" w:after="80" w:line="276" w:lineRule="auto"/>
-        <w:jc w:val="left"/>
+        <w:jc w:val="both"/>
       </w:pPr>
       <w:r>
         <w:rPr>
@@ -1061,7 +1979,7 @@
           <w:color w:val="000000"/>
           <w:sz w:val="28"/>
         </w:rPr>
-        <w:t>• Nhóm Thực nghiệm (Experimental Group, N = 60): Học tập và làm bài trên Hệ thống gia sư AI thích ứng.</w:t>
+        <w:t>• Nhóm Thực nghiệm AI (60 học sinh): Học tập và làm bài trên Hệ thống gia sư AI thích ứng.</w:t>
       </w:r>
     </w:p>
     <w:tbl>
@@ -1754,13 +2672,13 @@
     <w:p>
       <w:pPr>
         <w:spacing w:before="80" w:after="80" w:line="276" w:lineRule="auto"/>
-        <w:jc w:val="left"/>
+        <w:jc w:val="both"/>
       </w:pPr>
     </w:p>
     <w:p>
       <w:pPr>
         <w:spacing w:before="0" w:after="80" w:line="276" w:lineRule="auto"/>
-        <w:jc w:val="left"/>
+        <w:jc w:val="both"/>
       </w:pPr>
       <w:r>
         <w:rPr>
@@ -1776,7 +2694,7 @@
     <w:p>
       <w:pPr>
         <w:spacing w:before="0" w:after="80" w:line="276" w:lineRule="auto"/>
-        <w:jc w:val="left"/>
+        <w:jc w:val="both"/>
       </w:pPr>
       <w:r>
         <w:rPr>
@@ -1792,7 +2710,7 @@
     <w:p>
       <w:pPr>
         <w:spacing w:before="0" w:after="80" w:line="276" w:lineRule="auto"/>
-        <w:jc w:val="left"/>
+        <w:jc w:val="both"/>
       </w:pPr>
       <w:r>
         <w:rPr>
@@ -1808,7 +2726,7 @@
     <w:p>
       <w:pPr>
         <w:spacing w:before="0" w:after="80" w:line="276" w:lineRule="auto"/>
-        <w:jc w:val="left"/>
+        <w:jc w:val="both"/>
       </w:pPr>
       <w:r>
         <w:rPr>
@@ -1824,7 +2742,7 @@
     <w:p>
       <w:pPr>
         <w:spacing w:before="0" w:after="80" w:line="276" w:lineRule="auto"/>
-        <w:jc w:val="left"/>
+        <w:jc w:val="both"/>
       </w:pPr>
       <w:r>
         <w:rPr>
@@ -1839,7 +2757,7 @@
     </w:p>
     <w:p>
       <w:pPr>
-        <w:spacing w:before="240" w:after="80" w:line="276" w:lineRule="auto"/>
+        <w:spacing w:before="280" w:after="80" w:line="276" w:lineRule="auto"/>
         <w:jc w:val="left"/>
       </w:pPr>
       <w:r>
@@ -1872,7 +2790,7 @@
     <w:p>
       <w:pPr>
         <w:spacing w:before="0" w:after="80" w:line="276" w:lineRule="auto"/>
-        <w:jc w:val="left"/>
+        <w:jc w:val="both"/>
       </w:pPr>
       <w:r>
         <w:rPr>
@@ -1888,7 +2806,7 @@
     <w:p>
       <w:pPr>
         <w:spacing w:before="0" w:after="80" w:line="276" w:lineRule="auto"/>
-        <w:jc w:val="left"/>
+        <w:jc w:val="both"/>
       </w:pPr>
       <w:r>
         <w:rPr>
@@ -1920,7 +2838,7 @@
     <w:p>
       <w:pPr>
         <w:spacing w:before="0" w:after="80" w:line="276" w:lineRule="auto"/>
-        <w:jc w:val="left"/>
+        <w:jc w:val="both"/>
       </w:pPr>
       <w:r>
         <w:rPr>
@@ -1936,7 +2854,7 @@
     <w:p>
       <w:pPr>
         <w:spacing w:before="0" w:after="80" w:line="276" w:lineRule="auto"/>
-        <w:jc w:val="left"/>
+        <w:jc w:val="both"/>
       </w:pPr>
       <w:r>
         <w:rPr>
@@ -1951,7 +2869,7 @@
     </w:p>
     <w:p>
       <w:pPr>
-        <w:spacing w:before="240" w:after="80" w:line="276" w:lineRule="auto"/>
+        <w:spacing w:before="280" w:after="80" w:line="276" w:lineRule="auto"/>
         <w:jc w:val="left"/>
       </w:pPr>
       <w:r>
@@ -1968,7 +2886,7 @@
     <w:p>
       <w:pPr>
         <w:spacing w:before="0" w:after="80" w:line="276" w:lineRule="auto"/>
-        <w:jc w:val="left"/>
+        <w:jc w:val="both"/>
       </w:pPr>
       <w:r>
         <w:rPr>
@@ -1984,7 +2902,7 @@
     <w:p>
       <w:pPr>
         <w:spacing w:before="0" w:after="80" w:line="276" w:lineRule="auto"/>
-        <w:jc w:val="left"/>
+        <w:jc w:val="both"/>
       </w:pPr>
       <w:r>
         <w:rPr>
@@ -2000,7 +2918,7 @@
     <w:p>
       <w:pPr>
         <w:spacing w:before="0" w:after="80" w:line="276" w:lineRule="auto"/>
-        <w:jc w:val="left"/>
+        <w:jc w:val="both"/>
       </w:pPr>
       <w:r>
         <w:rPr>
@@ -2016,7 +2934,7 @@
     <w:p>
       <w:pPr>
         <w:spacing w:before="0" w:after="80" w:line="276" w:lineRule="auto"/>
-        <w:jc w:val="left"/>
+        <w:jc w:val="both"/>
       </w:pPr>
       <w:r>
         <w:rPr>
@@ -2032,7 +2950,7 @@
     <w:p>
       <w:pPr>
         <w:spacing w:before="0" w:after="80" w:line="276" w:lineRule="auto"/>
-        <w:jc w:val="left"/>
+        <w:jc w:val="both"/>
       </w:pPr>
       <w:r>
         <w:rPr>
@@ -2048,7 +2966,7 @@
     <w:p>
       <w:pPr>
         <w:spacing w:before="0" w:after="80" w:line="276" w:lineRule="auto"/>
-        <w:jc w:val="left"/>
+        <w:jc w:val="both"/>
       </w:pPr>
       <w:r>
         <w:rPr>
@@ -2062,13 +2980,38 @@
       </w:r>
     </w:p>
     <w:sectPr>
+      <w:footerReference w:type="default" r:id="rId9"/>
       <w:pgSz w:w="11909" w:h="16834"/>
       <w:pgMar w:top="1138" w:right="1138" w:bottom="1138" w:left="1699" w:header="720" w:footer="720" w:gutter="0"/>
       <w:cols w:space="720"/>
+      <w:titlePg/>
       <w:docGrid w:linePitch="360"/>
     </w:sectPr>
   </w:body>
 </w:document>
+</file>
+
+<file path=word/footer1.xml><?xml version="1.0" encoding="utf-8"?>
+<w:ftr xmlns:m="http://schemas.openxmlformats.org/officeDocument/2006/math" xmlns:mc="http://schemas.openxmlformats.org/markup-compatibility/2006" xmlns:mo="http://schemas.microsoft.com/office/mac/office/2008/main" xmlns:mv="urn:schemas-microsoft-com:mac:vml" xmlns:o="urn:schemas-microsoft-com:office:office" xmlns:r="http://schemas.openxmlformats.org/officeDocument/2006/relationships" xmlns:v="urn:schemas-microsoft-com:vml" xmlns:w10="urn:schemas-microsoft-com:office:word" xmlns:w14="http://schemas.microsoft.com/office/word/2010/wordml" xmlns:w="http://schemas.openxmlformats.org/wordprocessingml/2006/main" xmlns:wne="http://schemas.microsoft.com/office/word/2006/wordml" xmlns:wp14="http://schemas.microsoft.com/office/word/2010/wordprocessingDrawing" xmlns:wp="http://schemas.openxmlformats.org/drawingml/2006/wordprocessingDrawing" xmlns:wpc="http://schemas.microsoft.com/office/word/2010/wordprocessingCanvas" xmlns:wpg="http://schemas.microsoft.com/office/word/2010/wordprocessingGroup" xmlns:wpi="http://schemas.microsoft.com/office/word/2010/wordprocessingInk" xmlns:wps="http://schemas.microsoft.com/office/word/2010/wordprocessingShape" mc:Ignorable="w14 wp14">
+  <w:p>
+    <w:pPr>
+      <w:pStyle w:val="Footer"/>
+      <w:jc w:val="center"/>
+    </w:pPr>
+    <w:r/>
+    <w:r>
+      <w:rPr>
+        <w:rFonts w:ascii="Times New Roman" w:hAnsi="Times New Roman"/>
+        <w:color w:val="000000"/>
+        <w:sz w:val="22"/>
+      </w:rPr>
+      <w:fldChar w:fldCharType="begin"/>
+      <w:instrText xml:space="preserve">PAGE</w:instrText>
+      <w:fldChar w:fldCharType="separate"/>
+      <w:fldChar w:fldCharType="end"/>
+    </w:r>
+  </w:p>
+</w:ftr>
 </file>
 
 <file path=word/numbering.xml><?xml version="1.0" encoding="utf-8"?>

</xml_diff>